<commit_message>
update final report to current project state
</commit_message>
<xml_diff>
--- a/docs/GraphLink_Final_Raporu.docx
+++ b/docs/GraphLink_Final_Raporu.docx
@@ -303,9 +303,11 @@
         <w:br/>
         <w:t>tarihinde alinan 10 ornek dashboard isteginde ortalama API suresi 454.7 ms olarak olculmus, en dusuk deger</w:t>
         <w:br/>
-        <w:t>332 ms ve en yuksek deger 596 ms olmustur. Ayrica repo icindeki 7 adet validation/security unit testi</w:t>
+        <w:t>332 ms ve en yuksek deger 596 ms olmustur. Ayrica repo icindeki 61 testlik kalite paketi</w:t>
         <w:br/>
-        <w:t>basariyla gecmistir. GraphLink, teslim amacli bir demo olmasina ragmen, graph tabanli dusunmenin sosyal urun</w:t>
+        <w:t>yerel ortamda basariyla calismistir; Neo4j'e bagimli testler CI'da canli servisle kosacak sekilde ayarlanmistir.</w:t>
+        <w:br/>
+        <w:t>GraphLink, teslim amacli bir demo olmasina ragmen, graph tabanli dusunmenin sosyal urun</w:t>
         <w:br/>
         <w:t>tasarimi, aciklanabilir tavsiye sistemleri ve egitim amacli graph analitigi icin pratik bir temel sundugunu</w:t>
         <w:br/>
@@ -380,9 +382,11 @@
         <w:br/>
         <w:t>a local measurement session recorded an average dashboard response time of 454.7 ms across ten samples, with a</w:t>
         <w:br/>
-        <w:t>minimum of 332 ms and a maximum of 596 ms. In addition, seven validation and security-oriented unit tests</w:t>
+        <w:t>minimum of 332 ms and a maximum of 596 ms. In addition, the repository now contains a 61-test quality</w:t>
         <w:br/>
-        <w:t>passed successfully. Although GraphLink is intentionally scoped as an academic prototype rather than a production</w:t>
+        <w:t>package covering validation, security, route behavior, frontend smoke checks, and database-backed integration</w:t>
+        <w:br/>
+        <w:t>paths in CI. Although GraphLink is intentionally scoped as an academic prototype rather than a production</w:t>
         <w:br/>
         <w:t>SaaS product, it demonstrates that graph-first modeling provides a clear and practical foundation for social</w:t>
         <w:br/>
@@ -982,7 +986,7 @@
         <w:br/>
         <w:t>REST endpoint'in dokumante edilmesi, (4) GDS eklentileri aktifken topluluk ve path analizi sonucunun alinmasi,</w:t>
         <w:br/>
-        <w:t>(5) temel validation ve security testlerinin gecmesi. Bu raporun ilerleyen bolumlerinde bu kriterlerin ne</w:t>
+        <w:t>(5) validation, security, route ve entegrasyon testlerinin gecmesi. Bu raporun ilerleyen bolumlerinde bu kriterlerin ne</w:t>
         <w:br/>
         <w:t>olcude karsilandigi ayri ayri degerlendirilmektedir.</w:t>
       </w:r>
@@ -4985,11 +4989,11 @@
                 <w:rFonts w:ascii="Times New Roman" w:hAnsi="Times New Roman"/>
                 <w:sz w:val="20"/>
               </w:rPr>
-              <w:t>CI/CD ve E2E eksik</w:t>
+              <w:t>E2E tarayici otomasyonu sinirli</w:t>
               <w:br/>
               <w:t>Production-grade degil</w:t>
               <w:br/>
-              <w:t>Kucuk test kapsami</w:t>
+              <w:t>Buyuk veri benchmark'i yok</w:t>
             </w:r>
           </w:p>
         </w:tc>
@@ -13900,20 +13904,22 @@
     </w:p>
     <w:p>
       <w:r>
-        <w:t>Mevcut repo'da toplam 7 test bulunmaktadir ve hepsi basariyla gecmistir. Testler iki dosyada toplanmistir:</w:t>
+        <w:t>Mevcut repo'da toplam 61 test bulunmaktadir. Yerel Neo4j servisi olmayan makinede 57 test gecmis, 4 adet</w:t>
         <w:br/>
-        <w:t>security.test.js ve validation.test.js. Ilk grup normalizeEmail, password hash/compare, token imzalama ve</w:t>
+        <w:t>veritabani bagimli test otomatik skip edilmistir. GitHub Actions akisi Neo4j servis konteyneri baslattigi icin</w:t>
         <w:br/>
-        <w:t>hashToken davranisini; ikinci grup ise register/login schema validation kurallarini dogrular.</w:t>
-      </w:r>
-    </w:p>
-    <w:p>
-      <w:r>
-        <w:t>Bu durum test piramidinin tabaninda oldukca guclu bir validation/security odaği oldugunu, fakat integration ve</w:t>
+        <w:t>bu entegrasyon testleri CI ortaminda canli veritabaniyla kosacak sekilde ayarlanmistir.</w:t>
+      </w:r>
+    </w:p>
+    <w:p>
+      <w:r>
+        <w:t>Test paketi validation schema kurallari, security helper'lari, CSP kontrolu, sosyal route negative-path</w:t>
         <w:br/>
-        <w:t>E2E katmanlarinin henuz backlog'ta kaldigini gosterir. Dolayisiyla test stratejisi "minimum guvenlik + veri</w:t>
+        <w:t>davranislari, frontend static asset smoke testleri, monitoring ve auth akisini kapsar. Ayrica c8 ile coverage</w:t>
         <w:br/>
-        <w:t>dogrulama guvencesi" saglar; production seviyesi degildir.</w:t>
+        <w:t>raporu uretilir ve npm audit orta seviye zaafiyetlere kadar pipeline icinde kontrol edilir. Eksik kalan ana alan,</w:t>
+        <w:br/>
+        <w:t>tarayici tabanli Playwright/Cypress E2E senaryolari ve buyuk veri seti performans benchmark'idir.</w:t>
       </w:r>
     </w:p>
     <w:p>
@@ -16098,11 +16104,15 @@
     </w:p>
     <w:p>
       <w:r>
-        <w:t>Bununla birlikte proje henuz production hazirligi seviyesinde degildir. En kritik aciklar; E2E test eksikligi,</w:t>
+        <w:t>Bununla birlikte proje henuz production hazirligi seviyesinde degildir. En kritik kalan aciklar; tarayici</w:t>
         <w:br/>
-        <w:t>sinirli monitoring, kurumsal guvenlik ozelliklerinin olmamasi ve cok daha buyuk veri setlerinde benchmark</w:t>
+        <w:t>tabanli E2E test eksikligi, sinirli monitoring, kurumsal olcekli operasyon ozelliklerinin olmamasi ve cok daha</w:t>
         <w:br/>
-        <w:t>alinmamis olmasidir. Yine de final projesi baglaminda teknik hedeflerin savunulabilir oldugu aciktir.</w:t>
+        <w:t>buyuk veri setlerinde benchmark alinmamis olmasidir. Son guncellemeyle guvenlik varsayilanlari daha kapali hale</w:t>
+        <w:br/>
+        <w:t>getirilmis, CI'daki veritabani testleri aktif edilmistir. Final projesi baglaminda teknik hedeflerin</w:t>
+        <w:br/>
+        <w:t>savunulabilir oldugu aciktir.</w:t>
       </w:r>
     </w:p>
     <w:p>
@@ -16341,7 +16351,7 @@
         <w:pStyle w:val="ListBullet"/>
       </w:pPr>
       <w:r>
-        <w:t>V2: Gercek zamanli guncelleme, notification ve live graph refresh</w:t>
+        <w:t>V2: Live graph refresh ve notification deneyimini genisletme</w:t>
       </w:r>
     </w:p>
     <w:p>
@@ -16349,7 +16359,7 @@
         <w:pStyle w:val="ListBullet"/>
       </w:pPr>
       <w:r>
-        <w:t>V2: Cypress/Playwright E2E senaryolari ve CI pipeline</w:t>
+        <w:t>V2: Cypress/Playwright E2E senaryolari ve gorsel regresyon kontrolleri</w:t>
       </w:r>
     </w:p>
     <w:p>

</xml_diff>

<commit_message>
complete report references and front matter lists
</commit_message>
<xml_diff>
--- a/docs/GraphLink_Final_Raporu.docx
+++ b/docs/GraphLink_Final_Raporu.docx
@@ -412,13 +412,224 @@
       </w:r>
     </w:p>
     <w:p>
-      <w:r>
-        <w:fldChar w:fldCharType="begin"/>
-        <w:instrText xml:space="preserve">TOC \o "1-3" \h \z \u</w:instrText>
-        <w:fldChar w:fldCharType="separate">
-          <w:t>Icindekiler icin Word'de alanlari guncelleyin.</w:t>
-        </w:fldChar>
-        <w:fldChar w:fldCharType="end"/>
+      <w:pPr>
+        <w:spacing w:after="20"/>
+        <w:ind w:left="113"/>
+      </w:pPr>
+      <w:r>
+        <w:rPr>
+          <w:rFonts w:ascii="Times New Roman" w:hAnsi="Times New Roman"/>
+          <w:sz w:val="18"/>
+        </w:rPr>
+        <w:t>BEYAN  2</w:t>
+      </w:r>
+    </w:p>
+    <w:p>
+      <w:pPr>
+        <w:spacing w:after="20"/>
+        <w:ind w:left="113"/>
+      </w:pPr>
+      <w:r>
+        <w:rPr>
+          <w:rFonts w:ascii="Times New Roman" w:hAnsi="Times New Roman"/>
+          <w:sz w:val="18"/>
+        </w:rPr>
+        <w:t>OZET  3</w:t>
+      </w:r>
+    </w:p>
+    <w:p>
+      <w:pPr>
+        <w:spacing w:after="20"/>
+        <w:ind w:left="113"/>
+      </w:pPr>
+      <w:r>
+        <w:rPr>
+          <w:rFonts w:ascii="Times New Roman" w:hAnsi="Times New Roman"/>
+          <w:sz w:val="18"/>
+        </w:rPr>
+        <w:t>ABSTRACT  4</w:t>
+      </w:r>
+    </w:p>
+    <w:p>
+      <w:pPr>
+        <w:spacing w:after="20"/>
+        <w:ind w:left="113"/>
+      </w:pPr>
+      <w:r>
+        <w:rPr>
+          <w:rFonts w:ascii="Times New Roman" w:hAnsi="Times New Roman"/>
+          <w:sz w:val="18"/>
+        </w:rPr>
+        <w:t>KISALTMALAR VE SIMGELER  8</w:t>
+      </w:r>
+    </w:p>
+    <w:p>
+      <w:pPr>
+        <w:spacing w:after="20"/>
+        <w:ind w:left="113"/>
+      </w:pPr>
+      <w:r>
+        <w:rPr>
+          <w:rFonts w:ascii="Times New Roman" w:hAnsi="Times New Roman"/>
+          <w:sz w:val="18"/>
+        </w:rPr>
+        <w:t>1. GIRIS  8</w:t>
+      </w:r>
+    </w:p>
+    <w:p>
+      <w:pPr>
+        <w:spacing w:after="20"/>
+        <w:ind w:left="113"/>
+      </w:pPr>
+      <w:r>
+        <w:rPr>
+          <w:rFonts w:ascii="Times New Roman" w:hAnsi="Times New Roman"/>
+          <w:sz w:val="18"/>
+        </w:rPr>
+        <w:t>2. GEREKSINIM ANALIZI - PRD  10</w:t>
+      </w:r>
+    </w:p>
+    <w:p>
+      <w:pPr>
+        <w:spacing w:after="20"/>
+        <w:ind w:left="113"/>
+      </w:pPr>
+      <w:r>
+        <w:rPr>
+          <w:rFonts w:ascii="Times New Roman" w:hAnsi="Times New Roman"/>
+          <w:sz w:val="18"/>
+        </w:rPr>
+        <w:t>3. PIYASA VE REKABET ANALIZI  14</w:t>
+      </w:r>
+    </w:p>
+    <w:p>
+      <w:pPr>
+        <w:spacing w:after="20"/>
+        <w:ind w:left="113"/>
+      </w:pPr>
+      <w:r>
+        <w:rPr>
+          <w:rFonts w:ascii="Times New Roman" w:hAnsi="Times New Roman"/>
+          <w:sz w:val="18"/>
+        </w:rPr>
+        <w:t>4. TEKNOLOJI YIGINI (TECH STACK)  16</w:t>
+      </w:r>
+    </w:p>
+    <w:p>
+      <w:pPr>
+        <w:spacing w:after="20"/>
+        <w:ind w:left="113"/>
+      </w:pPr>
+      <w:r>
+        <w:rPr>
+          <w:rFonts w:ascii="Times New Roman" w:hAnsi="Times New Roman"/>
+          <w:sz w:val="18"/>
+        </w:rPr>
+        <w:t>5. SISTEM MIMARISI  22</w:t>
+      </w:r>
+    </w:p>
+    <w:p>
+      <w:pPr>
+        <w:spacing w:after="20"/>
+        <w:ind w:left="113"/>
+      </w:pPr>
+      <w:r>
+        <w:rPr>
+          <w:rFonts w:ascii="Times New Roman" w:hAnsi="Times New Roman"/>
+          <w:sz w:val="18"/>
+        </w:rPr>
+        <w:t>6. VERI MODELI VE API TASARIMI  25</w:t>
+      </w:r>
+    </w:p>
+    <w:p>
+      <w:pPr>
+        <w:spacing w:after="20"/>
+        <w:ind w:left="113"/>
+      </w:pPr>
+      <w:r>
+        <w:rPr>
+          <w:rFonts w:ascii="Times New Roman" w:hAnsi="Times New Roman"/>
+          <w:sz w:val="18"/>
+        </w:rPr>
+        <w:t>7. KULLANICI ARAYUZU TASARIMI  28</w:t>
+      </w:r>
+    </w:p>
+    <w:p>
+      <w:pPr>
+        <w:spacing w:after="20"/>
+        <w:ind w:left="113"/>
+      </w:pPr>
+      <w:r>
+        <w:rPr>
+          <w:rFonts w:ascii="Times New Roman" w:hAnsi="Times New Roman"/>
+          <w:sz w:val="18"/>
+        </w:rPr>
+        <w:t>8. GUVENLIK, PERFORMANS VE TEST  31</w:t>
+      </w:r>
+    </w:p>
+    <w:p>
+      <w:pPr>
+        <w:spacing w:after="20"/>
+        <w:ind w:left="113"/>
+      </w:pPr>
+      <w:r>
+        <w:rPr>
+          <w:rFonts w:ascii="Times New Roman" w:hAnsi="Times New Roman"/>
+          <w:sz w:val="18"/>
+        </w:rPr>
+        <w:t>9. MALIYET, GELIR MODELI VE GTM  33</w:t>
+      </w:r>
+    </w:p>
+    <w:p>
+      <w:pPr>
+        <w:spacing w:after="20"/>
+        <w:ind w:left="113"/>
+      </w:pPr>
+      <w:r>
+        <w:rPr>
+          <w:rFonts w:ascii="Times New Roman" w:hAnsi="Times New Roman"/>
+          <w:sz w:val="18"/>
+        </w:rPr>
+        <w:t>10. UYGULAMA VE GELISTIRME  35</w:t>
+      </w:r>
+    </w:p>
+    <w:p>
+      <w:pPr>
+        <w:spacing w:after="20"/>
+        <w:ind w:left="113"/>
+      </w:pPr>
+      <w:r>
+        <w:rPr>
+          <w:rFonts w:ascii="Times New Roman" w:hAnsi="Times New Roman"/>
+          <w:sz w:val="18"/>
+        </w:rPr>
+        <w:t>11. SONUC VE DEGERLENDIRME  40</w:t>
+      </w:r>
+    </w:p>
+    <w:p>
+      <w:pPr>
+        <w:spacing w:after="20"/>
+        <w:ind w:left="113"/>
+      </w:pPr>
+      <w:r>
+        <w:rPr>
+          <w:rFonts w:ascii="Times New Roman" w:hAnsi="Times New Roman"/>
+          <w:sz w:val="18"/>
+        </w:rPr>
+        <w:t>KAYNAKCA  41</w:t>
+      </w:r>
+    </w:p>
+    <w:p>
+      <w:pPr>
+        <w:spacing w:after="20"/>
+        <w:ind w:left="113"/>
+      </w:pPr>
+      <w:r>
+        <w:rPr>
+          <w:rFonts w:ascii="Times New Roman" w:hAnsi="Times New Roman"/>
+          <w:sz w:val="18"/>
+        </w:rPr>
+        <w:t>EKLER  42</w:t>
       </w:r>
     </w:p>
     <w:p>
@@ -435,10 +646,237 @@
       </w:r>
     </w:p>
     <w:p>
-      <w:r>
-        <w:t>Bu belgede tum sekiller "Sekil X" basliklariyla etiketlenmistir. Microsoft Word uzerinde belge acildiginda</w:t>
-        <w:br/>
-        <w:t>References / Insert Table of Figures komutu ile otomatik sekiller listesi olusturulabilir.</w:t>
+      <w:pPr>
+        <w:spacing w:after="20"/>
+        <w:ind w:left="113"/>
+      </w:pPr>
+      <w:r>
+        <w:rPr>
+          <w:rFonts w:ascii="Times New Roman" w:hAnsi="Times New Roman"/>
+          <w:sz w:val="16"/>
+        </w:rPr>
+        <w:t>Sekil 1: Sistem Context Diyagrami  22</w:t>
+      </w:r>
+    </w:p>
+    <w:p>
+      <w:pPr>
+        <w:spacing w:after="20"/>
+        <w:ind w:left="113"/>
+      </w:pPr>
+      <w:r>
+        <w:rPr>
+          <w:rFonts w:ascii="Times New Roman" w:hAnsi="Times New Roman"/>
+          <w:sz w:val="16"/>
+        </w:rPr>
+        <w:t>Sekil 2: Container Diyagrami  23</w:t>
+      </w:r>
+    </w:p>
+    <w:p>
+      <w:pPr>
+        <w:spacing w:after="20"/>
+        <w:ind w:left="113"/>
+      </w:pPr>
+      <w:r>
+        <w:rPr>
+          <w:rFonts w:ascii="Times New Roman" w:hAnsi="Times New Roman"/>
+          <w:sz w:val="16"/>
+        </w:rPr>
+        <w:t>Sekil 3: Login Akisi Sirali Diyagrami  24</w:t>
+      </w:r>
+    </w:p>
+    <w:p>
+      <w:pPr>
+        <w:spacing w:after="20"/>
+        <w:ind w:left="113"/>
+      </w:pPr>
+      <w:r>
+        <w:rPr>
+          <w:rFonts w:ascii="Times New Roman" w:hAnsi="Times New Roman"/>
+          <w:sz w:val="16"/>
+        </w:rPr>
+        <w:t>Sekil 4: Production Deployment Topolojisi  24</w:t>
+      </w:r>
+    </w:p>
+    <w:p>
+      <w:pPr>
+        <w:spacing w:after="20"/>
+        <w:ind w:left="113"/>
+      </w:pPr>
+      <w:r>
+        <w:rPr>
+          <w:rFonts w:ascii="Times New Roman" w:hAnsi="Times New Roman"/>
+          <w:sz w:val="16"/>
+        </w:rPr>
+        <w:t>Sekil 5: Property Graph Veri Modeli  25</w:t>
+      </w:r>
+    </w:p>
+    <w:p>
+      <w:pPr>
+        <w:spacing w:after="20"/>
+        <w:ind w:left="113"/>
+      </w:pPr>
+      <w:r>
+        <w:rPr>
+          <w:rFonts w:ascii="Times New Roman" w:hAnsi="Times New Roman"/>
+          <w:sz w:val="16"/>
+        </w:rPr>
+        <w:t>Sekil 6: Uygulama Site Haritasi  28</w:t>
+      </w:r>
+    </w:p>
+    <w:p>
+      <w:pPr>
+        <w:spacing w:after="20"/>
+        <w:ind w:left="113"/>
+      </w:pPr>
+      <w:r>
+        <w:rPr>
+          <w:rFonts w:ascii="Times New Roman" w:hAnsi="Times New Roman"/>
+          <w:sz w:val="16"/>
+        </w:rPr>
+        <w:t>Sekil 7: Ana Kullanici Akisi  29</w:t>
+      </w:r>
+    </w:p>
+    <w:p>
+      <w:pPr>
+        <w:spacing w:after="20"/>
+        <w:ind w:left="113"/>
+      </w:pPr>
+      <w:r>
+        <w:rPr>
+          <w:rFonts w:ascii="Times New Roman" w:hAnsi="Times New Roman"/>
+          <w:sz w:val="16"/>
+        </w:rPr>
+        <w:t>Sekil 8: Landing Sayfasi Wireframe  30</w:t>
+      </w:r>
+    </w:p>
+    <w:p>
+      <w:pPr>
+        <w:spacing w:after="20"/>
+        <w:ind w:left="113"/>
+      </w:pPr>
+      <w:r>
+        <w:rPr>
+          <w:rFonts w:ascii="Times New Roman" w:hAnsi="Times New Roman"/>
+          <w:sz w:val="16"/>
+        </w:rPr>
+        <w:t>Sekil 9: Dashboard Wireframe  30</w:t>
+      </w:r>
+    </w:p>
+    <w:p>
+      <w:pPr>
+        <w:spacing w:after="20"/>
+        <w:ind w:left="113"/>
+      </w:pPr>
+      <w:r>
+        <w:rPr>
+          <w:rFonts w:ascii="Times New Roman" w:hAnsi="Times New Roman"/>
+          <w:sz w:val="16"/>
+        </w:rPr>
+        <w:t>Sekil 10: Test Piramidi  32</w:t>
+      </w:r>
+    </w:p>
+    <w:p>
+      <w:pPr>
+        <w:spacing w:after="20"/>
+        <w:ind w:left="113"/>
+      </w:pPr>
+      <w:r>
+        <w:rPr>
+          <w:rFonts w:ascii="Times New Roman" w:hAnsi="Times New Roman"/>
+          <w:sz w:val="16"/>
+        </w:rPr>
+        <w:t>Sekil 11: Landing / Auth Ekrani  35</w:t>
+      </w:r>
+    </w:p>
+    <w:p>
+      <w:pPr>
+        <w:spacing w:after="20"/>
+        <w:ind w:left="113"/>
+      </w:pPr>
+      <w:r>
+        <w:rPr>
+          <w:rFonts w:ascii="Times New Roman" w:hAnsi="Times New Roman"/>
+          <w:sz w:val="16"/>
+        </w:rPr>
+        <w:t>Sekil 12: Hata Giris Durumu  36</w:t>
+      </w:r>
+    </w:p>
+    <w:p>
+      <w:pPr>
+        <w:spacing w:after="20"/>
+        <w:ind w:left="113"/>
+      </w:pPr>
+      <w:r>
+        <w:rPr>
+          <w:rFonts w:ascii="Times New Roman" w:hAnsi="Times New Roman"/>
+          <w:sz w:val="16"/>
+        </w:rPr>
+        <w:t>Sekil 13: Dashboard - Data Box  36</w:t>
+      </w:r>
+    </w:p>
+    <w:p>
+      <w:pPr>
+        <w:spacing w:after="20"/>
+        <w:ind w:left="113"/>
+      </w:pPr>
+      <w:r>
+        <w:rPr>
+          <w:rFonts w:ascii="Times New Roman" w:hAnsi="Times New Roman"/>
+          <w:sz w:val="16"/>
+        </w:rPr>
+        <w:t>Sekil 14: Kullanici Kartlari Paneli  37</w:t>
+      </w:r>
+    </w:p>
+    <w:p>
+      <w:pPr>
+        <w:spacing w:after="20"/>
+        <w:ind w:left="113"/>
+      </w:pPr>
+      <w:r>
+        <w:rPr>
+          <w:rFonts w:ascii="Times New Roman" w:hAnsi="Times New Roman"/>
+          <w:sz w:val="16"/>
+        </w:rPr>
+        <w:t>Sekil 15: Gonderi Akisi Paneli  37</w:t>
+      </w:r>
+    </w:p>
+    <w:p>
+      <w:pPr>
+        <w:spacing w:after="20"/>
+        <w:ind w:left="113"/>
+      </w:pPr>
+      <w:r>
+        <w:rPr>
+          <w:rFonts w:ascii="Times New Roman" w:hAnsi="Times New Roman"/>
+          <w:sz w:val="16"/>
+        </w:rPr>
+        <w:t>Sekil 16: Graph Analiz Paneli  38</w:t>
+      </w:r>
+    </w:p>
+    <w:p>
+      <w:pPr>
+        <w:spacing w:after="20"/>
+        <w:ind w:left="113"/>
+      </w:pPr>
+      <w:r>
+        <w:rPr>
+          <w:rFonts w:ascii="Times New Roman" w:hAnsi="Times New Roman"/>
+          <w:sz w:val="16"/>
+        </w:rPr>
+        <w:t>Sekil 17: Mobil Gorunum  39</w:t>
+      </w:r>
+    </w:p>
+    <w:p>
+      <w:pPr>
+        <w:spacing w:after="20"/>
+        <w:ind w:left="113"/>
+      </w:pPr>
+      <w:r>
+        <w:rPr>
+          <w:rFonts w:ascii="Times New Roman" w:hAnsi="Times New Roman"/>
+          <w:sz w:val="16"/>
+        </w:rPr>
+        <w:t>Sekil 18: Swagger / API Dokumantasyonu  40</w:t>
       </w:r>
     </w:p>
     <w:p>
@@ -455,10 +893,419 @@
       </w:r>
     </w:p>
     <w:p>
-      <w:r>
-        <w:t>Bu belgede tum tablolar "Tablo X" basliklariyla etiketlenmistir. Microsoft Word uzerinde References / Insert</w:t>
-        <w:br/>
-        <w:t>Table of Figures komutu tablo etiketleri icin de kullanilabilir.</w:t>
+      <w:pPr>
+        <w:spacing w:after="20"/>
+        <w:ind w:left="113"/>
+      </w:pPr>
+      <w:r>
+        <w:rPr>
+          <w:rFonts w:ascii="Times New Roman" w:hAnsi="Times New Roman"/>
+          <w:sz w:val="14"/>
+        </w:rPr>
+        <w:t>Tablo 1: Kisaltmalar  8</w:t>
+      </w:r>
+    </w:p>
+    <w:p>
+      <w:pPr>
+        <w:spacing w:after="20"/>
+        <w:ind w:left="113"/>
+      </w:pPr>
+      <w:r>
+        <w:rPr>
+          <w:rFonts w:ascii="Times New Roman" w:hAnsi="Times New Roman"/>
+          <w:sz w:val="14"/>
+        </w:rPr>
+        <w:t>Tablo 2: MoSCoW Onceliklendirmesi  9</w:t>
+      </w:r>
+    </w:p>
+    <w:p>
+      <w:pPr>
+        <w:spacing w:after="20"/>
+        <w:ind w:left="113"/>
+      </w:pPr>
+      <w:r>
+        <w:rPr>
+          <w:rFonts w:ascii="Times New Roman" w:hAnsi="Times New Roman"/>
+          <w:sz w:val="14"/>
+        </w:rPr>
+        <w:t>Tablo 3: Persona 1 Karti  10</w:t>
+      </w:r>
+    </w:p>
+    <w:p>
+      <w:pPr>
+        <w:spacing w:after="20"/>
+        <w:ind w:left="113"/>
+      </w:pPr>
+      <w:r>
+        <w:rPr>
+          <w:rFonts w:ascii="Times New Roman" w:hAnsi="Times New Roman"/>
+          <w:sz w:val="14"/>
+        </w:rPr>
+        <w:t>Tablo 4: Persona 2 Karti  10</w:t>
+      </w:r>
+    </w:p>
+    <w:p>
+      <w:pPr>
+        <w:spacing w:after="20"/>
+        <w:ind w:left="113"/>
+      </w:pPr>
+      <w:r>
+        <w:rPr>
+          <w:rFonts w:ascii="Times New Roman" w:hAnsi="Times New Roman"/>
+          <w:sz w:val="14"/>
+        </w:rPr>
+        <w:t>Tablo 5: Persona Karsilastirmasi  11</w:t>
+      </w:r>
+    </w:p>
+    <w:p>
+      <w:pPr>
+        <w:spacing w:after="20"/>
+        <w:ind w:left="113"/>
+      </w:pPr>
+      <w:r>
+        <w:rPr>
+          <w:rFonts w:ascii="Times New Roman" w:hAnsi="Times New Roman"/>
+          <w:sz w:val="14"/>
+        </w:rPr>
+        <w:t>Tablo 6: MVP Kapsamindaki Temel Ozellikler  11</w:t>
+      </w:r>
+    </w:p>
+    <w:p>
+      <w:pPr>
+        <w:spacing w:after="20"/>
+        <w:ind w:left="113"/>
+      </w:pPr>
+      <w:r>
+        <w:rPr>
+          <w:rFonts w:ascii="Times New Roman" w:hAnsi="Times New Roman"/>
+          <w:sz w:val="14"/>
+        </w:rPr>
+        <w:t>Tablo 7: User Story ve Acceptance Criteria Listesi  11</w:t>
+      </w:r>
+    </w:p>
+    <w:p>
+      <w:pPr>
+        <w:spacing w:after="20"/>
+        <w:ind w:left="113"/>
+      </w:pPr>
+      <w:r>
+        <w:rPr>
+          <w:rFonts w:ascii="Times New Roman" w:hAnsi="Times New Roman"/>
+          <w:sz w:val="14"/>
+        </w:rPr>
+        <w:t>Tablo 8: NFR Matrisi  13</w:t>
+      </w:r>
+    </w:p>
+    <w:p>
+      <w:pPr>
+        <w:spacing w:after="20"/>
+        <w:ind w:left="113"/>
+      </w:pPr>
+      <w:r>
+        <w:rPr>
+          <w:rFonts w:ascii="Times New Roman" w:hAnsi="Times New Roman"/>
+          <w:sz w:val="14"/>
+        </w:rPr>
+        <w:t>Tablo 9: TAM / SAM / SOM Ozeti  14</w:t>
+      </w:r>
+    </w:p>
+    <w:p>
+      <w:pPr>
+        <w:spacing w:after="20"/>
+        <w:ind w:left="113"/>
+      </w:pPr>
+      <w:r>
+        <w:rPr>
+          <w:rFonts w:ascii="Times New Roman" w:hAnsi="Times New Roman"/>
+          <w:sz w:val="14"/>
+        </w:rPr>
+        <w:t>Tablo 10: Rakiplerle Ozellik Karsilastirmasi  14</w:t>
+      </w:r>
+    </w:p>
+    <w:p>
+      <w:pPr>
+        <w:spacing w:after="20"/>
+        <w:ind w:left="113"/>
+      </w:pPr>
+      <w:r>
+        <w:rPr>
+          <w:rFonts w:ascii="Times New Roman" w:hAnsi="Times New Roman"/>
+          <w:sz w:val="14"/>
+        </w:rPr>
+        <w:t>Tablo 11: SWOT Matrisi  15</w:t>
+      </w:r>
+    </w:p>
+    <w:p>
+      <w:pPr>
+        <w:spacing w:after="20"/>
+        <w:ind w:left="113"/>
+      </w:pPr>
+      <w:r>
+        <w:rPr>
+          <w:rFonts w:ascii="Times New Roman" w:hAnsi="Times New Roman"/>
+          <w:sz w:val="14"/>
+        </w:rPr>
+        <w:t>Tablo 12: Projede Kullanilan Teknoloji Katmanlari  16</w:t>
+      </w:r>
+    </w:p>
+    <w:p>
+      <w:pPr>
+        <w:spacing w:after="20"/>
+        <w:ind w:left="113"/>
+      </w:pPr>
+      <w:r>
+        <w:rPr>
+          <w:rFonts w:ascii="Times New Roman" w:hAnsi="Times New Roman"/>
+          <w:sz w:val="14"/>
+        </w:rPr>
+        <w:t>Tablo 13: ADR Ozet Listesi  25</w:t>
+      </w:r>
+    </w:p>
+    <w:p>
+      <w:pPr>
+        <w:spacing w:after="20"/>
+        <w:ind w:left="113"/>
+      </w:pPr>
+      <w:r>
+        <w:rPr>
+          <w:rFonts w:ascii="Times New Roman" w:hAnsi="Times New Roman"/>
+          <w:sz w:val="14"/>
+        </w:rPr>
+        <w:t>Tablo 14: Node Tanimi - User  25</w:t>
+      </w:r>
+    </w:p>
+    <w:p>
+      <w:pPr>
+        <w:spacing w:after="20"/>
+        <w:ind w:left="113"/>
+      </w:pPr>
+      <w:r>
+        <w:rPr>
+          <w:rFonts w:ascii="Times New Roman" w:hAnsi="Times New Roman"/>
+          <w:sz w:val="14"/>
+        </w:rPr>
+        <w:t>Tablo 15: Node Tanimi - Post  26</w:t>
+      </w:r>
+    </w:p>
+    <w:p>
+      <w:pPr>
+        <w:spacing w:after="20"/>
+        <w:ind w:left="113"/>
+      </w:pPr>
+      <w:r>
+        <w:rPr>
+          <w:rFonts w:ascii="Times New Roman" w:hAnsi="Times New Roman"/>
+          <w:sz w:val="14"/>
+        </w:rPr>
+        <w:t>Tablo 16: Node Tanimi - Session  26</w:t>
+      </w:r>
+    </w:p>
+    <w:p>
+      <w:pPr>
+        <w:spacing w:after="20"/>
+        <w:ind w:left="113"/>
+      </w:pPr>
+      <w:r>
+        <w:rPr>
+          <w:rFonts w:ascii="Times New Roman" w:hAnsi="Times New Roman"/>
+          <w:sz w:val="14"/>
+        </w:rPr>
+        <w:t>Tablo 17: Iliski Tanimi - FOLLOWS  26</w:t>
+      </w:r>
+    </w:p>
+    <w:p>
+      <w:pPr>
+        <w:spacing w:after="20"/>
+        <w:ind w:left="113"/>
+      </w:pPr>
+      <w:r>
+        <w:rPr>
+          <w:rFonts w:ascii="Times New Roman" w:hAnsi="Times New Roman"/>
+          <w:sz w:val="14"/>
+        </w:rPr>
+        <w:t>Tablo 18: Iliski Tanimi - LIKED / AUTHORED / HAS_SESSION  26</w:t>
+      </w:r>
+    </w:p>
+    <w:p>
+      <w:pPr>
+        <w:spacing w:after="20"/>
+        <w:ind w:left="113"/>
+      </w:pPr>
+      <w:r>
+        <w:rPr>
+          <w:rFonts w:ascii="Times New Roman" w:hAnsi="Times New Roman"/>
+          <w:sz w:val="14"/>
+        </w:rPr>
+        <w:t>Tablo 19: Constraint ve Indeks Kararlari  27</w:t>
+      </w:r>
+    </w:p>
+    <w:p>
+      <w:pPr>
+        <w:spacing w:after="20"/>
+        <w:ind w:left="113"/>
+      </w:pPr>
+      <w:r>
+        <w:rPr>
+          <w:rFonts w:ascii="Times New Roman" w:hAnsi="Times New Roman"/>
+          <w:sz w:val="14"/>
+        </w:rPr>
+        <w:t>Tablo 20: Ana API Endpoint'leri  27</w:t>
+      </w:r>
+    </w:p>
+    <w:p>
+      <w:pPr>
+        <w:spacing w:after="20"/>
+        <w:ind w:left="113"/>
+      </w:pPr>
+      <w:r>
+        <w:rPr>
+          <w:rFonts w:ascii="Times New Roman" w:hAnsi="Times New Roman"/>
+          <w:sz w:val="14"/>
+        </w:rPr>
+        <w:t>Tablo 21: Rate Limit Kararlari  28</w:t>
+      </w:r>
+    </w:p>
+    <w:p>
+      <w:pPr>
+        <w:spacing w:after="20"/>
+        <w:ind w:left="113"/>
+      </w:pPr>
+      <w:r>
+        <w:rPr>
+          <w:rFonts w:ascii="Times New Roman" w:hAnsi="Times New Roman"/>
+          <w:sz w:val="14"/>
+        </w:rPr>
+        <w:t>Tablo 22: Renk Paleti  29</w:t>
+      </w:r>
+    </w:p>
+    <w:p>
+      <w:pPr>
+        <w:spacing w:after="20"/>
+        <w:ind w:left="113"/>
+      </w:pPr>
+      <w:r>
+        <w:rPr>
+          <w:rFonts w:ascii="Times New Roman" w:hAnsi="Times New Roman"/>
+          <w:sz w:val="14"/>
+        </w:rPr>
+        <w:t>Tablo 23: Tipografi Skalasi  29</w:t>
+      </w:r>
+    </w:p>
+    <w:p>
+      <w:pPr>
+        <w:spacing w:after="20"/>
+        <w:ind w:left="113"/>
+      </w:pPr>
+      <w:r>
+        <w:rPr>
+          <w:rFonts w:ascii="Times New Roman" w:hAnsi="Times New Roman"/>
+          <w:sz w:val="14"/>
+        </w:rPr>
+        <w:t>Tablo 24: Responsive ve Token Stratejisi  30</w:t>
+      </w:r>
+    </w:p>
+    <w:p>
+      <w:pPr>
+        <w:spacing w:after="20"/>
+        <w:ind w:left="113"/>
+      </w:pPr>
+      <w:r>
+        <w:rPr>
+          <w:rFonts w:ascii="Times New Roman" w:hAnsi="Times New Roman"/>
+          <w:sz w:val="14"/>
+        </w:rPr>
+        <w:t>Tablo 25: OWASP Top 10 (2021) Uyarlama Matrisi  31</w:t>
+      </w:r>
+    </w:p>
+    <w:p>
+      <w:pPr>
+        <w:spacing w:after="20"/>
+        <w:ind w:left="113"/>
+      </w:pPr>
+      <w:r>
+        <w:rPr>
+          <w:rFonts w:ascii="Times New Roman" w:hAnsi="Times New Roman"/>
+          <w:sz w:val="14"/>
+        </w:rPr>
+        <w:t>Tablo 26: Performans Metrikleri ve Hedefler  32</w:t>
+      </w:r>
+    </w:p>
+    <w:p>
+      <w:pPr>
+        <w:spacing w:after="20"/>
+        <w:ind w:left="113"/>
+      </w:pPr>
+      <w:r>
+        <w:rPr>
+          <w:rFonts w:ascii="Times New Roman" w:hAnsi="Times New Roman"/>
+          <w:sz w:val="14"/>
+        </w:rPr>
+        <w:t>Tablo 27: Business Model Canvas  33</w:t>
+      </w:r>
+    </w:p>
+    <w:p>
+      <w:pPr>
+        <w:spacing w:after="20"/>
+        <w:ind w:left="113"/>
+      </w:pPr>
+      <w:r>
+        <w:rPr>
+          <w:rFonts w:ascii="Times New Roman" w:hAnsi="Times New Roman"/>
+          <w:sz w:val="14"/>
+        </w:rPr>
+        <w:t>Tablo 28: Fiyatlandirma (Varsayimsal 3 Tier)  33</w:t>
+      </w:r>
+    </w:p>
+    <w:p>
+      <w:pPr>
+        <w:spacing w:after="20"/>
+        <w:ind w:left="113"/>
+      </w:pPr>
+      <w:r>
+        <w:rPr>
+          <w:rFonts w:ascii="Times New Roman" w:hAnsi="Times New Roman"/>
+          <w:sz w:val="14"/>
+        </w:rPr>
+        <w:t>Tablo 29: Maliyet Analizi  34</w:t>
+      </w:r>
+    </w:p>
+    <w:p>
+      <w:pPr>
+        <w:spacing w:after="20"/>
+        <w:ind w:left="113"/>
+      </w:pPr>
+      <w:r>
+        <w:rPr>
+          <w:rFonts w:ascii="Times New Roman" w:hAnsi="Times New Roman"/>
+          <w:sz w:val="14"/>
+        </w:rPr>
+        <w:t>Tablo 30: Unit Economics (Varsayim)  34</w:t>
+      </w:r>
+    </w:p>
+    <w:p>
+      <w:pPr>
+        <w:spacing w:after="20"/>
+        <w:ind w:left="113"/>
+      </w:pPr>
+      <w:r>
+        <w:rPr>
+          <w:rFonts w:ascii="Times New Roman" w:hAnsi="Times New Roman"/>
+          <w:sz w:val="14"/>
+        </w:rPr>
+        <w:t>Tablo 31: Kullanilan Bagimliliklar  40</w:t>
+      </w:r>
+    </w:p>
+    <w:p>
+      <w:pPr>
+        <w:spacing w:after="20"/>
+        <w:ind w:left="113"/>
+      </w:pPr>
+      <w:r>
+        <w:rPr>
+          <w:rFonts w:ascii="Times New Roman" w:hAnsi="Times New Roman"/>
+          <w:sz w:val="14"/>
+        </w:rPr>
+        <w:t>Tablo 32: Zorluk, Cozum ve Ogrenim  41</w:t>
       </w:r>
     </w:p>
     <w:p>
@@ -16460,92 +17307,92 @@
     </w:p>
     <w:p>
       <w:r>
-        <w:t>[1] Fortune Business Insights. (2026). Graph Database Market Size, Share &amp; Industry Analysis. https://www.fortunebusinessinsights.com/graph-database-market-105916</w:t>
-      </w:r>
-    </w:p>
-    <w:p>
-      <w:r>
-        <w:t>[2] Neo4j. (2026). Neo4j Community Edition. https://neo4j.com/product/community-edition/</w:t>
-      </w:r>
-    </w:p>
-    <w:p>
-      <w:r>
-        <w:t>[3] Neo4j. (2026). Neo4j Pricing. https://neo4j.com/pricing/</w:t>
-      </w:r>
-    </w:p>
-    <w:p>
-      <w:r>
-        <w:t>[4] Neo4j. (2026). Cypher Manual - Introduction. https://neo4j.com/docs/cypher-manual/current/introduction/</w:t>
-      </w:r>
-    </w:p>
-    <w:p>
-      <w:r>
-        <w:t>[5] Neo4j. (2026). Neo4j Graph Data Science Library Manual v2026.03. https://neo4j.com/docs/graph-data-science/current/</w:t>
-      </w:r>
-    </w:p>
-    <w:p>
-      <w:r>
-        <w:t>[6] Neo4j. (2026). APOC Core Documentation - Introduction. https://neo4j.com/docs/apoc/current/introduction/</w:t>
-      </w:r>
-    </w:p>
-    <w:p>
-      <w:r>
-        <w:t>[7] Cytoscape.js. (2026). Cytoscape.js Documentation. https://js.cytoscape.org/</w:t>
-      </w:r>
-    </w:p>
-    <w:p>
-      <w:r>
-        <w:t>[8] OWASP Foundation. (2026). OWASP Top 10:2021. https://owasp.org/Top10/2021/</w:t>
-      </w:r>
-    </w:p>
-    <w:p>
-      <w:r>
-        <w:t>[9] W3C. (2025). Web Content Accessibility Guidelines (WCAG) 2.1. https://www.w3.org/TR/WCAG21/</w:t>
-      </w:r>
-    </w:p>
-    <w:p>
-      <w:r>
-        <w:t>[10] Stack Overflow. (2011). SQL query for mutual friends. https://stackoverflow.com/questions/6701090/sql-query-for-mutual-friends</w:t>
-      </w:r>
-    </w:p>
-    <w:p>
-      <w:r>
-        <w:t>[11] Stack Overflow. (2017). 'friends of friends' SQL query. https://stackoverflow.com/questions/43913201/friends-of-friends-sql-query</w:t>
-      </w:r>
-    </w:p>
-    <w:p>
-      <w:r>
-        <w:t>[12] Reddit / r/facebook. (2026, February 21). 'People You May Know' is getting creepy. https://www.reddit.com/r/facebook/comments/1rb42e3/people_you_may_know_is_getting_creepy_looking_for/</w:t>
-      </w:r>
-    </w:p>
-    <w:p>
-      <w:r>
-        <w:t>[13] Reddit / r/facebook. (2025). Facebook 'People you may know' recommending a person who I passed in the street? https://www.reddit.com/r/facebook/comments/1kihoma/facebook_people_you_may_know_recommending_a/</w:t>
-      </w:r>
-    </w:p>
-    <w:p>
-      <w:r>
-        <w:t>[14] Kumu. (2026). Pricing. https://www.kumu.io/pricing</w:t>
-      </w:r>
-    </w:p>
-    <w:p>
-      <w:r>
-        <w:t>[15] Kumu. (2026). About. https://kumu.io/about</w:t>
-      </w:r>
-    </w:p>
-    <w:p>
-      <w:r>
-        <w:t>[16] Linkurious. (2026). Pricing. https://linkurious.com/pricing/</w:t>
-      </w:r>
-    </w:p>
-    <w:p>
-      <w:r>
-        <w:t>[17] Linkurious. (2026). About. https://linkurious.com/about/</w:t>
-      </w:r>
-    </w:p>
-    <w:p>
-      <w:r>
-        <w:t>[18] Neo4j. (2026). Company. https://neo4j.com/company/</w:t>
+        <w:t>[1] Fortune Business Insights, "Graph Database Market Size, Share &amp; Industry Analysis," 2026. [Online]. Available: https://www.fortunebusinessinsights.com/graph-database-market-105916. Accessed: May 22, 2026.</w:t>
+      </w:r>
+    </w:p>
+    <w:p>
+      <w:r>
+        <w:t>[2] Neo4j, "Neo4j Community Edition," 2026. [Online]. Available: https://neo4j.com/product/community-edition/. Accessed: May 22, 2026.</w:t>
+      </w:r>
+    </w:p>
+    <w:p>
+      <w:r>
+        <w:t>[3] Neo4j, "Neo4j Pricing," 2026. [Online]. Available: https://neo4j.com/pricing/. Accessed: May 22, 2026.</w:t>
+      </w:r>
+    </w:p>
+    <w:p>
+      <w:r>
+        <w:t>[4] Neo4j, "Cypher Manual: Introduction," 2026. [Online]. Available: https://neo4j.com/docs/cypher-manual/current/introduction/. Accessed: May 22, 2026.</w:t>
+      </w:r>
+    </w:p>
+    <w:p>
+      <w:r>
+        <w:t>[5] Neo4j, "Neo4j Graph Data Science Library Manual," 2026. [Online]. Available: https://neo4j.com/docs/graph-data-science/current/. Accessed: May 22, 2026.</w:t>
+      </w:r>
+    </w:p>
+    <w:p>
+      <w:r>
+        <w:t>[6] Neo4j, "APOC Core Documentation: Introduction," 2026. [Online]. Available: https://neo4j.com/docs/apoc/current/introduction/. Accessed: May 22, 2026.</w:t>
+      </w:r>
+    </w:p>
+    <w:p>
+      <w:r>
+        <w:t>[7] Cytoscape.js, "Cytoscape.js Documentation," 2026. [Online]. Available: https://js.cytoscape.org/. Accessed: May 22, 2026.</w:t>
+      </w:r>
+    </w:p>
+    <w:p>
+      <w:r>
+        <w:t>[8] OWASP Foundation, "OWASP Top 10:2021," 2026. [Online]. Available: https://owasp.org/Top10/2021/. Accessed: May 22, 2026.</w:t>
+      </w:r>
+    </w:p>
+    <w:p>
+      <w:r>
+        <w:t>[9] W3C, "Web Content Accessibility Guidelines (WCAG) 2.1," 2025. [Online]. Available: https://www.w3.org/TR/WCAG21/. Accessed: May 22, 2026.</w:t>
+      </w:r>
+    </w:p>
+    <w:p>
+      <w:r>
+        <w:t>[10] Stack Overflow, "SQL query for mutual friends," 2011. [Online]. Available: https://stackoverflow.com/questions/6701090/sql-query-for-mutual-friends. Accessed: May 22, 2026.</w:t>
+      </w:r>
+    </w:p>
+    <w:p>
+      <w:r>
+        <w:t>[11] Stack Overflow, "'friends of friends' SQL query," 2017. [Online]. Available: https://stackoverflow.com/questions/43913201/friends-of-friends-sql-query. Accessed: May 22, 2026.</w:t>
+      </w:r>
+    </w:p>
+    <w:p>
+      <w:r>
+        <w:t>[12] Reddit, "'People You May Know' is getting creepy," r/facebook, 2026. [Online]. Available: https://www.reddit.com/r/facebook/comments/1rb42e3/people_you_may_know_is_getting_creepy_looking_for/. Accessed: May 22, 2026.</w:t>
+      </w:r>
+    </w:p>
+    <w:p>
+      <w:r>
+        <w:t>[13] Reddit, "Facebook 'People you may know' recommending a person who I passed in the street?," r/facebook, 2025. [Online]. Available: https://www.reddit.com/r/facebook/comments/1kihoma/facebook_people_you_may_know_recommending_a/. Accessed: May 22, 2026.</w:t>
+      </w:r>
+    </w:p>
+    <w:p>
+      <w:r>
+        <w:t>[14] Kumu, "Pricing," 2026. [Online]. Available: https://www.kumu.io/pricing. Accessed: May 22, 2026.</w:t>
+      </w:r>
+    </w:p>
+    <w:p>
+      <w:r>
+        <w:t>[15] Kumu, "About," 2026. [Online]. Available: https://kumu.io/about. Accessed: May 22, 2026.</w:t>
+      </w:r>
+    </w:p>
+    <w:p>
+      <w:r>
+        <w:t>[16] Linkurious, "Pricing," 2026. [Online]. Available: https://linkurious.com/pricing/. Accessed: May 22, 2026.</w:t>
+      </w:r>
+    </w:p>
+    <w:p>
+      <w:r>
+        <w:t>[17] Linkurious, "About," 2026. [Online]. Available: https://linkurious.com/about/. Accessed: May 22, 2026.</w:t>
+      </w:r>
+    </w:p>
+    <w:p>
+      <w:r>
+        <w:t>[18] Neo4j, "Company," 2026. [Online]. Available: https://neo4j.com/company/. Accessed: May 22, 2026.</w:t>
       </w:r>
     </w:p>
     <w:p>

</xml_diff>